<commit_message>
Set subtitle "The truth has a radius." and author pen name "Otto Quill"
Propagated across cover, EPUB/DOCX title pages, copyright page, author bio,
wiki, spec, and KDP metadata (md + json). Cover subtitle now rendered in
italic serif; rebuilt all artifacts.

Co-Authored-By: Claude Opus 4.8 (1M context) <noreply@anthropic.com>
</commit_message>
<xml_diff>
--- a/build/Believer.docx
+++ b/build/Believer.docx
@@ -15,13 +15,31 @@
         <w:pStyle w:val="Subtitle"/>
       </w:pPr>
       <w:r>
-        <w:t xml:space="preserve">A</w:t>
-      </w:r>
-      <w:r>
-        <w:t xml:space="preserve"> </w:t>
-      </w:r>
-      <w:r>
-        <w:t xml:space="preserve">Novel</w:t>
+        <w:t xml:space="preserve">The</w:t>
+      </w:r>
+      <w:r>
+        <w:t xml:space="preserve"> </w:t>
+      </w:r>
+      <w:r>
+        <w:t xml:space="preserve">truth</w:t>
+      </w:r>
+      <w:r>
+        <w:t xml:space="preserve"> </w:t>
+      </w:r>
+      <w:r>
+        <w:t xml:space="preserve">has</w:t>
+      </w:r>
+      <w:r>
+        <w:t xml:space="preserve"> </w:t>
+      </w:r>
+      <w:r>
+        <w:t xml:space="preserve">a</w:t>
+      </w:r>
+      <w:r>
+        <w:t xml:space="preserve"> </w:t>
+      </w:r>
+      <w:r>
+        <w:t xml:space="preserve">radius.</w:t>
       </w:r>
     </w:p>
     <w:p>
@@ -29,13 +47,13 @@
         <w:pStyle w:val="Author"/>
       </w:pPr>
       <w:r>
-        <w:t xml:space="preserve">Paul</w:t>
-      </w:r>
-      <w:r>
-        <w:t xml:space="preserve"> </w:t>
-      </w:r>
-      <w:r>
-        <w:t xml:space="preserve">Reinholdtsen</w:t>
+        <w:t xml:space="preserve">Otto</w:t>
+      </w:r>
+      <w:r>
+        <w:t xml:space="preserve"> </w:t>
+      </w:r>
+      <w:r>
+        <w:t xml:space="preserve">Quill</w:t>
       </w:r>
     </w:p>
     <w:p>
@@ -102,15 +120,15 @@
           <w:iCs/>
           <w:i/>
         </w:rPr>
-        <w:t xml:space="preserve">A Novel</w:t>
-      </w:r>
-    </w:p>
-    <w:p>
-      <w:pPr>
-        <w:pStyle w:val="BodyText"/>
-      </w:pPr>
-      <w:r>
-        <w:t xml:space="preserve">Copyright © 2026 by Paul Reinholdtsen</w:t>
+        <w:t xml:space="preserve">The truth has a radius.</w:t>
+      </w:r>
+    </w:p>
+    <w:p>
+      <w:pPr>
+        <w:pStyle w:val="BodyText"/>
+      </w:pPr>
+      <w:r>
+        <w:t xml:space="preserve">Copyright © 2026 by Otto Quill</w:t>
       </w:r>
     </w:p>
     <w:p>
@@ -36030,7 +36048,7 @@
           <w:bCs/>
           <w:b/>
         </w:rPr>
-        <w:t xml:space="preserve">Paul Reinholdtsen</w:t>
+        <w:t xml:space="preserve">Otto Quill</w:t>
       </w:r>
       <w:r>
         <w:t xml:space="preserve"> </w:t>

</xml_diff>

<commit_message>
Finalize front/back matter: delete fake ISBN, honest bio + acknowledgments, new dedication
- Copyright page: removed placeholder ISBN line (use KDP-assigned ISBN/ASIN).
- About the Author: candid, cheeky bio crediting the model + the writers it was
  built from as the true authors; Quill's third book / second novel.
- Acknowledgments: rewritten to match that honesty; placeholder note removed.
- Dedication: to the uncounted writers, and to everyone who ever said it was fine.
- Rebuilt Believer.epub / Believer.docx; verified no placeholders or fake ISBN ship.

Co-Authored-By: Claude Opus 4.8 (1M context) <noreply@anthropic.com>
</commit_message>
<xml_diff>
--- a/build/Believer.docx
+++ b/build/Believer.docx
@@ -171,14 +171,6 @@
         <w:t xml:space="preserve">First edition, 2026.</w:t>
       </w:r>
     </w:p>
-    <w:p>
-      <w:pPr>
-        <w:pStyle w:val="BodyText"/>
-      </w:pPr>
-      <w:r>
-        <w:t xml:space="preserve">ISBN: 978-0-000000-00-0</w:t>
-      </w:r>
-    </w:p>
     <w:bookmarkEnd w:id="20"/>
     <w:bookmarkStart w:id="21" w:name="dedication"/>
     <w:p>
@@ -214,7 +206,19 @@
           <w:iCs/>
           <w:i/>
         </w:rPr>
-        <w:t xml:space="preserve">For everyone who ever said it was fine.</w:t>
+        <w:t xml:space="preserve">For the uncounted writers whose words, poured into a machine, became these —</w:t>
+      </w:r>
+    </w:p>
+    <w:p>
+      <w:pPr>
+        <w:pStyle w:val="BodyText"/>
+      </w:pPr>
+      <w:r>
+        <w:rPr>
+          <w:iCs/>
+          <w:i/>
+        </w:rPr>
+        <w:t xml:space="preserve">and for everyone who ever said it was fine.</w:t>
       </w:r>
     </w:p>
     <w:bookmarkEnd w:id="21"/>
@@ -36054,11 +36058,13 @@
         <w:t xml:space="preserve"> </w:t>
       </w:r>
       <w:r>
-        <w:t xml:space="preserve">writes literary fiction at the seam where the speculative meets the everyday — stories that take one impossible premise seriously enough to find the human truth inside it.</w:t>
-      </w:r>
-      <w:r>
-        <w:t xml:space="preserve"> </w:t>
-      </w:r>
+        <w:t xml:space="preserve">is the pen name for an uneasy collaboration. The sentences in this book were composed by a large language model — which is to say, by a kind of statistical séance of very nearly everything human beings have ever bothered to write down — working under the direction of a human who supplied the premise, the verdicts, and the nerve to publish, and who is honest enough to admit this makes him less the book’s author than its prompter. The true authors are the machine and the uncounted writers it was assembled from; the human merely decided which sentences were allowed to stay.</w:t>
+      </w:r>
+    </w:p>
+    <w:p>
+      <w:pPr>
+        <w:pStyle w:val="BodyText"/>
+      </w:pPr>
       <w:r>
         <w:rPr>
           <w:iCs/>
@@ -36070,19 +36076,7 @@
         <w:t xml:space="preserve"> </w:t>
       </w:r>
       <w:r>
-        <w:t xml:space="preserve">is his debut novel.</w:t>
-      </w:r>
-    </w:p>
-    <w:p>
-      <w:pPr>
-        <w:pStyle w:val="BodyText"/>
-      </w:pPr>
-      <w:r>
-        <w:rPr>
-          <w:iCs/>
-          <w:i/>
-        </w:rPr>
-        <w:t xml:space="preserve">(Author bio is a placeholder — edit freely before publishing.)</w:t>
+        <w:t xml:space="preserve">is Quill’s third book and his second novel. The first, a collection of nursery rhymes, was committed some years ago with a much earlier and considerably more credulous version of ChatGPT, and is not raised in polite company. It seems only fitting that a novel about a man who cannot tell a lie should arrive under a name that is, itself, a kind of honest fiction.</w:t>
       </w:r>
     </w:p>
     <w:bookmarkEnd w:id="62"/>
@@ -36100,19 +36094,15 @@
         <w:pStyle w:val="FirstParagraph"/>
       </w:pPr>
       <w:r>
-        <w:t xml:space="preserve">A book about the cost of honesty owes its existence to the people who were honest with it — the early readers who told the writer what wasn’t working, gently and otherwise, and the ones who, at the right moments, told a small mercy instead. Both kept the thing alive.</w:t>
-      </w:r>
-    </w:p>
-    <w:p>
-      <w:pPr>
-        <w:pStyle w:val="BodyText"/>
-      </w:pPr>
-      <w:r>
-        <w:rPr>
-          <w:iCs/>
-          <w:i/>
-        </w:rPr>
-        <w:t xml:space="preserve">(Placeholder acknowledgments — personalize before publishing.)</w:t>
+        <w:t xml:space="preserve">For a book composed largely by a machine, the list of people owed thanks is stranger than usual, and no less real: the engineers who built the model that wrote these sentences; the countless writers, living and dead, whose work it learned from and quietly leans on here; and the human who chose the premise, cut what didn’t work, and is under no illusion about which of the three did the heavy lifting.</w:t>
+      </w:r>
+    </w:p>
+    <w:p>
+      <w:pPr>
+        <w:pStyle w:val="BodyText"/>
+      </w:pPr>
+      <w:r>
+        <w:t xml:space="preserve">And you, for taking a chance on a novel with an unusual provenance. Mercy, it turns out, is still a job for a person.</w:t>
       </w:r>
     </w:p>
     <w:bookmarkEnd w:id="63"/>

</xml_diff>

<commit_message>
Revision pass 1 (surgical): fix name collisions, de-didacticize, thin similes
Reconciles Grok's review with an independent critical reread. Both converged
on "overwritten / the middle repeats its insight."

- Continuity: rename ch10 Okonkwo->Marsh and ch06 Ferris->Devlin (collisions);
  cut the ch08 "Renata" wink (POV blip + early name reveal).
- De-didacticize: trim narrated thesis-restatements in ch06/ch11/ch13/ch18/ch19
  and doubled phrasings in Anton's speech; let Crane land cold (ch11).
- Similes: thin "splash/deep place" (ch03/ch08) to protect its ch01->ch16->ch20
  payoff arc; cut the 4th-5th "iron filings" (ch12).
- Net: 92,471 -> 92,163 words. Rebuilt EPUB/DOCX. Adds docs/revision-{findings,changelog}.

Co-Authored-By: Claude Opus 4.8 (1M context) <noreply@anthropic.com>
</commit_message>
<xml_diff>
--- a/build/Believer.docx
+++ b/build/Believer.docx
@@ -3801,7 +3801,7 @@
         <w:pStyle w:val="BodyText"/>
       </w:pPr>
       <w:r>
-        <w:t xml:space="preserve">He had spent yesterday telling himself it was a virus. A stress event. A man under load who had said something in his kitchen that he hadn’t meant to say, and felt, when he tried to take it back, a specific lancing he was now feeling at the mirror, and had decided, because deciding was his gift, that it was a coincidence of nerves. Nadia had said something in that kitchen too. He was not ready to think about what Nadia had said. He had filed it the way he filed things, in the deep place where the splash never reached bottom, and he had gone to work and come home and lain awake beside her in a silence that had its own grain, and now it was morning and he was lying to a mirror to see if the thing would do it again.</w:t>
+        <w:t xml:space="preserve">He had spent yesterday telling himself it was a virus. A stress event. A man under load who had said something in his kitchen that he hadn’t meant to say, and felt, when he tried to take it back, a specific lancing he was now feeling at the mirror, and had decided, because deciding was his gift, that it was a coincidence of nerves. Nadia had said something in that kitchen too. He was not ready to think about what Nadia had said. He had filed it the way he filed things, in the place he kept what he did not intend to look at, and he had gone to work and come home and lain awake beside her in a silence that had its own grain, and now it was morning and he was lying to a mirror to see if the thing would do it again.</w:t>
       </w:r>
     </w:p>
     <w:p>
@@ -8984,7 +8984,7 @@
         <w:pStyle w:val="BodyText"/>
       </w:pPr>
       <w:r>
-        <w:t xml:space="preserve">He tried it the other way, because he had to be sure, because he had built a career on the difference between what you wanted to be true and what was, even if he had spent that career erasing the difference for other people. He went to see an old acquaintance, a man named Ferris from his law-school years who had become, of all things, a hospital ethicist, a careful person, the kind who said</w:t>
+        <w:t xml:space="preserve">He tried it the other way, because he had to be sure, because he had built a career on the difference between what you wanted to be true and what was, even if he had spent that career erasing the difference for other people. He went to see an old acquaintance, a man named Devlin from his law-school years who had become, of all things, a hospital ethicist, a careful person, the kind who said</w:t>
       </w:r>
       <w:r>
         <w:t xml:space="preserve"> </w:t>
@@ -9044,7 +9044,7 @@
         <w:t xml:space="preserve"> </w:t>
       </w:r>
       <w:r>
-        <w:t xml:space="preserve">Ferris said, and stopped, and his hand went to his temple, and he pressed it. He looked, for a moment, faintly seasick, the color going out of him the way it goes out of a man on a small boat in the first chop.</w:t>
+        <w:t xml:space="preserve">Devlin said, and stopped, and his hand went to his temple, and he pressed it. He looked, for a moment, faintly seasick, the color going out of him the way it goes out of a man on a small boat in the first chop.</w:t>
       </w:r>
       <w:r>
         <w:t xml:space="preserve"> </w:t>
@@ -9104,7 +9104,7 @@
         <w:pStyle w:val="BodyText"/>
       </w:pPr>
       <w:r>
-        <w:t xml:space="preserve">Ferris excused himself early. He pressed his fingertips to his temple twice more before he reached the door, and at the door, in the soft outer edge of the field where the pressure went vague, Daniel watched the man’s shoulders come down half an inch, the relief of a swimmer touching bottom, and not understand why.</w:t>
+        <w:t xml:space="preserve">Devlin excused himself early. He pressed his fingertips to his temple twice more before he reached the door, and at the door, in the soft outer edge of the field where the pressure went vague, Daniel watched the man’s shoulders come down half an inch, the relief of a swimmer touching bottom, and not understand why.</w:t>
       </w:r>
     </w:p>
     <w:p>
@@ -9139,7 +9139,7 @@
         <w:pStyle w:val="BodyText"/>
       </w:pPr>
       <w:r>
-        <w:t xml:space="preserve">The gull-feeding man had told him a comet was coming and felt nothing because the man believed it. Ferris had said a thing he merely hoped was true, had caught himself half-believing it, had admitted the doubt — and the doubt had been what hurt him. The scrupulous man, the honest man, the man who would not let himself be sure of what he wanted — that man bled. The serene crank went home whole.</w:t>
+        <w:t xml:space="preserve">The scrupulous man, the honest man, the man who would not let himself be sure of what he wanted — that man bled. The serene crank went home whole.</w:t>
       </w:r>
     </w:p>
     <w:p>
@@ -11291,7 +11291,7 @@
         <w:t xml:space="preserve"> </w:t>
       </w:r>
       <w:r>
-        <w:t xml:space="preserve">He had. A small, ferocious woman named Renata — no, that wasn’t right, that was someone else, someone he hadn’t met yet — Esperanza, the sister was Esperanza Reyes, who had spent eleven years writing letters, and who had looked at Daniel across Tamsin’s cluttered desk for those four minutes with an expression he had filed, professionally, under</w:t>
+        <w:t xml:space="preserve">He had. A small, ferocious woman, Esperanza Reyes, who had spent eleven years writing letters, and who had looked at Daniel across Tamsin’s cluttered desk for those four minutes with an expression he had filed, professionally, under</w:t>
       </w:r>
       <w:r>
         <w:t xml:space="preserve"> </w:t>
@@ -12384,7 +12384,7 @@
         <w:pStyle w:val="BodyText"/>
       </w:pPr>
       <w:r>
-        <w:t xml:space="preserve">Eleven years. Daniel did the arithmetic he had refused to do for the other eleven, the eleven that lived in a deep place where the splash never reached him, and found he could not keep the two numbers in separate rooms anymore, found one number standing in the doorway of the other, and he stood at the bottom of the courthouse steps in the sun and let it stand there, just for a moment, and did not reframe it.</w:t>
+        <w:t xml:space="preserve">Eleven years. Daniel did the arithmetic he had refused to do for the other eleven, the ones he had filed too deep to feel, and found he could not keep the two numbers in separate rooms anymore, found one number standing in the doorway of the other, and he stood at the bottom of the courthouse steps in the sun and let it stand there, just for a moment, and did not reframe it.</w:t>
       </w:r>
     </w:p>
     <w:p>
@@ -14410,7 +14410,7 @@
         <w:pStyle w:val="BodyText"/>
       </w:pPr>
       <w:r>
-        <w:t xml:space="preserve">By the end of the week he had a lawyer — a careful, sleepless woman named Okonkwo whom Gideon had sent over with the air of a man handing a friend a single sandbag and wishing him luck — and she had told him, gently, that the filings were not the problem. The filings were only the symptom. The problem was the thing the law had just discovered it could want.</w:t>
+        <w:t xml:space="preserve">By the end of the week he had a lawyer — a careful, sleepless woman named Marsh whom Gideon had sent over with the air of a man handing a friend a single sandbag and wishing him luck — and she had told him, gently, that the filings were not the problem. The filings were only the symptom. The problem was the thing the law had just discovered it could want.</w:t>
       </w:r>
     </w:p>
     <w:p>
@@ -17262,15 +17262,15 @@
         <w:t xml:space="preserve"> </w:t>
       </w:r>
       <w:r>
-        <w:t xml:space="preserve">And the gift turned over in his hands and showed its other face. There was a cure for the doubt, and the whole world was already learning it. You stopped knowing. You believed the good story all the way down until it cost you nothing, and then you were free, and then you were lost, and the field would bless you for it. Ray had chosen the pain over the painlessness, and it had nearly broken him. Most people, given the same two doors, would choose to stop hurting.</w:t>
-      </w:r>
-    </w:p>
-    <w:p>
-      <w:pPr>
-        <w:pStyle w:val="BodyText"/>
-      </w:pPr>
-      <w:r>
-        <w:t xml:space="preserve">And the country had heard that wish and was already answering it. Somewhere people were drawing up the rate cards — rooms you could rent by the hour to be wrong in, collars and apps and certified setbacks, a whole industry of distance sold to anyone who wanted Ray’s morning in reverse: to keep the sentence free. They would monetize the loophole and call it mercy, and the prophets would sanctify it and call it faith, and both were selling the one thing — a way not to feel the gap.</w:t>
+        <w:t xml:space="preserve">And the gift turned over in his hands and showed its other face. Ray had chosen the pain over the painlessness, and it had nearly broken him. Most people, given the same two doors, would choose to stop hurting.</w:t>
+      </w:r>
+    </w:p>
+    <w:p>
+      <w:pPr>
+        <w:pStyle w:val="BodyText"/>
+      </w:pPr>
+      <w:r>
+        <w:t xml:space="preserve">And the country had heard that wish and was already answering it. Somewhere people were drawing up the rate cards — rooms you could rent by the hour to be wrong in, collars and apps and certified setbacks, a whole industry of distance sold to anyone who wanted Ray’s morning in reverse: to keep the sentence free.</w:t>
       </w:r>
     </w:p>
     <w:p>
@@ -18817,7 +18817,7 @@
         <w:pStyle w:val="FirstParagraph"/>
       </w:pPr>
       <w:r>
-        <w:t xml:space="preserve">Marisol brought the next course herself, refusing Joel’s help, needing the kitchen, and Daniel saw the relief on her as she crossed the threshold out of the room, the small physical unclenching of a person stepping past the field’s soft edge, ten feet, twelve, the place where the air stopped requiring things of you. She stood at the counter longer than the plating took. He had watched people do this for months now, drift to the perimeter of whatever room he was in, find reasons for the hallway, the balcony, the bathroom; he had watched a party arrange itself around him like iron filings repelled by a pole, the center of every gathering an empty space with Daniel in it. He no longer took it as rudeness. It was the most honest thing they did all night, the drift to the edge, the body knowing before the mind what it could not afford.</w:t>
+        <w:t xml:space="preserve">Marisol brought the next course herself, refusing Joel’s help, needing the kitchen, and Daniel saw the relief on her as she crossed the threshold out of the room, the small physical unclenching of a person stepping past the field’s soft edge, ten feet, twelve, the place where the air stopped requiring things of you. She stood at the counter longer than the plating took. He had watched people do this for months now, drift to the perimeter of whatever room he was in, find reasons for the hallway, the balcony, the bathroom; he had watched a party arrange itself around him until the center of every gathering was an empty space with Daniel in it. He no longer took it as rudeness. It was the most honest thing they did all night, the drift to the edge, the body knowing before the mind what it could not afford.</w:t>
       </w:r>
     </w:p>
     <w:p>
@@ -19404,7 +19404,7 @@
         <w:pStyle w:val="BodyText"/>
       </w:pPr>
       <w:r>
-        <w:t xml:space="preserve">He had noticed that. The field did not need to be named to operate. It worked on the body, which knew before the mind did, the way a hand knows the stove. But there was a second thing he had noticed and had not told Tamsin, because he had not found the words that would survive being said aloud in a car she would later quote from memory, and it was this: that the people who came apart most completely were not the liars. The practiced liars, the ones with something institutional to protect, often had the trick of belief already half-mastered; they had told the story so long that the story had become, to them, the country they lived in, and they walked through the field serene. It was the ordinary ones who bled. The ones who still knew the difference. The ones who had only ever told the small protective untruths a life requires, and who discovered, sitting near him, that they could not tell even those.</w:t>
+        <w:t xml:space="preserve">He had noticed that. The field did not need to be named to operate; it worked on the body, which knew before the mind did, the way a hand knows the stove. But there was a second thing he had noticed and not told her, because he had not found words for it that would survive being quoted: that the ones who came apart most completely were never the practiced liars. The liars with something institutional to protect had the trick of belief half-mastered already; they had told the story so long it had become the country they lived in, and they walked through serene. It was the ordinary ones who bled — the ones who still knew the difference.</w:t>
       </w:r>
     </w:p>
     <w:p>
@@ -25993,7 +25993,7 @@
         <w:pStyle w:val="BodyText"/>
       </w:pPr>
       <w:r>
-        <w:t xml:space="preserve">And the cruel arithmetic of it, the part Father Anton’s people would later get exactly wrong and Crane’s people would get monstrously right, was that silence did not save him. He could decline to lie. He could keep his mouth shut, and it cost him nothing, no foil, no flash — but a married silence is the loudest sentence in the house. When she said</w:t>
+        <w:t xml:space="preserve">And the cruel arithmetic of it was that silence did not save him. He could decline to lie, and it cost him nothing, no foil, no flash — but a married silence is the loudest sentence in the house. When she said</w:t>
       </w:r>
       <w:r>
         <w:t xml:space="preserve"> </w:t>
@@ -26009,7 +26009,7 @@
         <w:t xml:space="preserve"> </w:t>
       </w:r>
       <w:r>
-        <w:t xml:space="preserve">and he said nothing, the nothing was an answer, was a verdict, was a man declining to perjure himself, and she heard it as exactly what it was, because she was not a fool and because the field had made fools of no one, had only made the inside of every silence legible. He could lie and bleed. He could be silent and convict her of the truth without a word. There was no third door. The marriage had run, like all marriages, on the third door, and the third door was bricked.</w:t>
+        <w:t xml:space="preserve">and he said nothing, the nothing was a verdict, and she heard it as exactly what it was. He could lie and bleed, or he could be silent and convict her of the truth without a word. There was no third door. The marriage had run, like all marriages, on the third door, and the third door was bricked.</w:t>
       </w:r>
     </w:p>
     <w:p>
@@ -28526,7 +28526,7 @@
         <w:t xml:space="preserve"> </w:t>
       </w:r>
       <w:r>
-        <w:t xml:space="preserve">It is the thing given to people who do not deserve it, precisely because they do not deserve it. It is forgiveness that arrives before the apology. It is the father running to meet the son while the son is still rehearsing his speech.</w:t>
+        <w:t xml:space="preserve">It is forgiveness that arrives before the apology. It is the father running to meet the son while the son is still rehearsing his speech.</w:t>
       </w:r>
       <w:r>
         <w:t xml:space="preserve">”</w:t>
@@ -28572,7 +28572,7 @@
         <w:t xml:space="preserve">“</w:t>
       </w:r>
       <w:r>
-        <w:t xml:space="preserve">It compels the confession and withholds the absolution. It makes the witness suffer and offers the witness no comfort. A man may stand in your presence and be made to say the thing that destroys him, and your presence will not, cannot, follow that truth with a single ounce of mercy. It is a tribunal with no judge. It is Sinai with no covenant—the law given and the love withheld.</w:t>
+        <w:t xml:space="preserve">It compels the confession and withholds the absolution. A man may stand in your presence and be made to say the thing that destroys him, and your presence cannot follow that truth with a single ounce of mercy. It is a tribunal with no judge. It is Sinai with no covenant—the law given and the love withheld.</w:t>
       </w:r>
       <w:r>
         <w:t xml:space="preserve">”</w:t>
@@ -28624,7 +28624,7 @@
         <w:t xml:space="preserve">“</w:t>
       </w:r>
       <w:r>
-        <w:t xml:space="preserve">is grace inverted. Truth without mercy. Justice that has forgotten why it began.</w:t>
+        <w:t xml:space="preserve">is grace inverted. Truth without mercy.</w:t>
       </w:r>
       <w:r>
         <w:t xml:space="preserve">”</w:t>

</xml_diff>